<commit_message>
Manual: cover the four new batch and undo features
4-7 walks through the per-student 진로 column, the bulk length fit and
the repeated-sentence check, each with a screenshot of the real screen;
5-6 explains undo and which actions it covers. Existing sections and
the edits made outside the repo are untouched.

Co-Authored-By: Claude Opus 4.8 <noreply@anthropic.com>
</commit_message>
<xml_diff>
--- a/docs/생기부_도우미_사용설명서.docx
+++ b/docs/생기부_도우미_사용설명서.docx
@@ -3833,6 +3833,430 @@
     </w:p>
     <w:p>
       <w:pPr>
+        <w:pStyle w:val="21"/>
+        <w:spacing w:before="240" w:after="100"/>
+      </w:pPr>
+      <w:r>
+        <w:rPr>
+          <w:rFonts w:ascii="맑은 고딕" w:hAnsi="맑은 고딕" w:eastAsia="맑은 고딕"/>
+          <w:b/>
+          <w:color w:val="1A1A1A"/>
+          <w:sz w:val="26"/>
+        </w:rPr>
+        <w:t>4-7. 반 전체 결과 활용하기</w:t>
+      </w:r>
+    </w:p>
+    <w:p>
+      <w:pPr>
+        <w:spacing w:before="60" w:after="80"/>
+      </w:pPr>
+      <w:r>
+        <w:rPr>
+          <w:rFonts w:ascii="맑은 고딕" w:hAnsi="맑은 고딕" w:eastAsia="맑은 고딕"/>
+          <w:b w:val="0"/>
+          <w:sz w:val="21"/>
+        </w:rPr>
+        <w:t>반 전체를 검사하면 아래 기능들을 함께 쓸 수 있습니다. 나이스에 넣기 직전 마무리 작업에 쓰시면 됩니다.</w:t>
+      </w:r>
+    </w:p>
+    <w:p>
+      <w:pPr>
+        <w:spacing w:before="160" w:after="80"/>
+      </w:pPr>
+      <w:r>
+        <w:rPr>
+          <w:rFonts w:ascii="맑은 고딕" w:hAnsi="맑은 고딕" w:eastAsia="맑은 고딕"/>
+          <w:b/>
+          <w:sz w:val="21"/>
+        </w:rPr>
+        <w:t>① 학생마다 다른 희망 진로 반영하기</w:t>
+      </w:r>
+    </w:p>
+    <w:p>
+      <w:pPr>
+        <w:spacing w:before="60" w:after="80"/>
+      </w:pPr>
+      <w:r>
+        <w:rPr>
+          <w:rFonts w:ascii="맑은 고딕" w:hAnsi="맑은 고딕" w:eastAsia="맑은 고딕"/>
+          <w:b w:val="0"/>
+          <w:sz w:val="21"/>
+        </w:rPr>
+        <w:t>엑셀(명렬표)에 진로 열이 있으면, 학생마다 다른 진로를 반영해 대체 표현을 추천합니다. 표를 올리면 아래처럼 열을 고르는 칸이 나옵니다.</w:t>
+      </w:r>
+    </w:p>
+    <w:p>
+      <w:pPr>
+        <w:spacing w:before="160" w:after="40"/>
+        <w:jc w:val="center"/>
+      </w:pPr>
+      <w:r>
+        <w:drawing>
+          <wp:inline xmlns:a="http://schemas.openxmlformats.org/drawingml/2006/main" xmlns:pic="http://schemas.openxmlformats.org/drawingml/2006/picture">
+            <wp:extent cx="5760720" cy="4651100"/>
+            <wp:docPr id="15" name="Picture 15"/>
+            <wp:cNvGraphicFramePr>
+              <a:graphicFrameLocks noChangeAspect="1"/>
+            </wp:cNvGraphicFramePr>
+            <a:graphic>
+              <a:graphicData uri="http://schemas.openxmlformats.org/drawingml/2006/picture">
+                <pic:pic>
+                  <pic:nvPicPr>
+                    <pic:cNvPr id="0" name="fig_major_col.png"/>
+                    <pic:cNvPicPr/>
+                  </pic:nvPicPr>
+                  <pic:blipFill>
+                    <a:blip r:embed="rId22"/>
+                    <a:stretch>
+                      <a:fillRect/>
+                    </a:stretch>
+                  </pic:blipFill>
+                  <pic:spPr>
+                    <a:xfrm>
+                      <a:off x="0" y="0"/>
+                      <a:ext cx="5760720" cy="4651100"/>
+                    </a:xfrm>
+                    <a:prstGeom prst="rect"/>
+                  </pic:spPr>
+                </pic:pic>
+              </a:graphicData>
+            </a:graphic>
+          </wp:inline>
+        </w:drawing>
+      </w:r>
+    </w:p>
+    <w:p>
+      <w:pPr>
+        <w:spacing w:before="0" w:after="200"/>
+        <w:jc w:val="center"/>
+      </w:pPr>
+      <w:r>
+        <w:rPr>
+          <w:rFonts w:ascii="맑은 고딕" w:hAnsi="맑은 고딕" w:eastAsia="맑은 고딕"/>
+          <w:b w:val="0"/>
+          <w:i/>
+          <w:color w:val="595959"/>
+          <w:sz w:val="17"/>
+        </w:rPr>
+        <w:t>▲ 이름·내용 열과 함께 '희망 진로 열'을 고르는 화면</w:t>
+      </w:r>
+    </w:p>
+    <w:p>
+      <w:pPr>
+        <w:pStyle w:val="a0"/>
+        <w:spacing w:before="40" w:after="40"/>
+      </w:pPr>
+      <w:r>
+        <w:rPr>
+          <w:rFonts w:ascii="맑은 고딕" w:hAnsi="맑은 고딕" w:eastAsia="맑은 고딕"/>
+          <w:sz w:val="21"/>
+        </w:rPr>
+        <w:t>진로 열을 고르면 학생마다 그 진로에 맞춰 추천 표현이 달라집니다.</w:t>
+      </w:r>
+    </w:p>
+    <w:p>
+      <w:pPr>
+        <w:pStyle w:val="a0"/>
+        <w:spacing w:before="40" w:after="40"/>
+      </w:pPr>
+      <w:r>
+        <w:rPr>
+          <w:rFonts w:ascii="맑은 고딕" w:hAnsi="맑은 고딕" w:eastAsia="맑은 고딕"/>
+          <w:sz w:val="21"/>
+        </w:rPr>
+        <w:t>비워 두거나 칸이 빈 학생은 왼쪽 설정의 진로가 대신 쓰입니다.</w:t>
+      </w:r>
+    </w:p>
+    <w:p>
+      <w:pPr>
+        <w:pStyle w:val="a0"/>
+        <w:spacing w:before="40" w:after="40"/>
+      </w:pPr>
+      <w:r>
+        <w:rPr>
+          <w:rFonts w:ascii="맑은 고딕" w:hAnsi="맑은 고딕" w:eastAsia="맑은 고딕"/>
+          <w:sz w:val="21"/>
+        </w:rPr>
+        <w:t>결과 요약표에 '진로' 칸이 생겨서 제대로 읽혔는지 확인할 수 있습니다.</w:t>
+      </w:r>
+    </w:p>
+    <w:p>
+      <w:pPr>
+        <w:spacing w:before="160" w:after="80"/>
+      </w:pPr>
+      <w:r>
+        <w:rPr>
+          <w:rFonts w:ascii="맑은 고딕" w:hAnsi="맑은 고딕" w:eastAsia="맑은 고딕"/>
+          <w:b/>
+          <w:sz w:val="21"/>
+        </w:rPr>
+        <w:t>② 분량 초과한 학생만 한 번에 줄이기</w:t>
+      </w:r>
+    </w:p>
+    <w:p>
+      <w:pPr>
+        <w:spacing w:before="60" w:after="80"/>
+      </w:pPr>
+      <w:r>
+        <w:rPr>
+          <w:rFonts w:ascii="맑은 고딕" w:hAnsi="맑은 고딕" w:eastAsia="맑은 고딕"/>
+          <w:b w:val="0"/>
+          <w:sz w:val="21"/>
+        </w:rPr>
+        <w:t>제한 글자 수를 넘긴 학생이 몇 명인지 세어 단추에 표시됩니다. 누르면 그 학생들만 한꺼번에 분량을 맞춥니다.</w:t>
+      </w:r>
+    </w:p>
+    <w:p>
+      <w:pPr>
+        <w:spacing w:before="160" w:after="40"/>
+        <w:jc w:val="center"/>
+      </w:pPr>
+      <w:r>
+        <w:drawing>
+          <wp:inline xmlns:a="http://schemas.openxmlformats.org/drawingml/2006/main" xmlns:pic="http://schemas.openxmlformats.org/drawingml/2006/picture">
+            <wp:extent cx="5760720" cy="2159439"/>
+            <wp:docPr id="16" name="Picture 16"/>
+            <wp:cNvGraphicFramePr>
+              <a:graphicFrameLocks noChangeAspect="1"/>
+            </wp:cNvGraphicFramePr>
+            <a:graphic>
+              <a:graphicData uri="http://schemas.openxmlformats.org/drawingml/2006/picture">
+                <pic:pic>
+                  <pic:nvPicPr>
+                    <pic:cNvPr id="0" name="fig_bulk_length.png"/>
+                    <pic:cNvPicPr/>
+                  </pic:nvPicPr>
+                  <pic:blipFill>
+                    <a:blip r:embed="rId23"/>
+                    <a:stretch>
+                      <a:fillRect/>
+                    </a:stretch>
+                  </pic:blipFill>
+                  <pic:spPr>
+                    <a:xfrm>
+                      <a:off x="0" y="0"/>
+                      <a:ext cx="5760720" cy="2159439"/>
+                    </a:xfrm>
+                    <a:prstGeom prst="rect"/>
+                  </pic:spPr>
+                </pic:pic>
+              </a:graphicData>
+            </a:graphic>
+          </wp:inline>
+        </w:drawing>
+      </w:r>
+    </w:p>
+    <w:p>
+      <w:pPr>
+        <w:spacing w:before="0" w:after="200"/>
+        <w:jc w:val="center"/>
+      </w:pPr>
+      <w:r>
+        <w:rPr>
+          <w:rFonts w:ascii="맑은 고딕" w:hAnsi="맑은 고딕" w:eastAsia="맑은 고딕"/>
+          <w:b w:val="0"/>
+          <w:i/>
+          <w:color w:val="595959"/>
+          <w:sz w:val="17"/>
+        </w:rPr>
+        <w:t>▲ 초과한 학생 수가 표시된 '분량 초과 학생 일괄 맞추기' 단추</w:t>
+      </w:r>
+    </w:p>
+    <w:p>
+      <w:pPr>
+        <w:pStyle w:val="a0"/>
+        <w:spacing w:before="40" w:after="40"/>
+      </w:pPr>
+      <w:r>
+        <w:rPr>
+          <w:rFonts w:ascii="맑은 고딕" w:hAnsi="맑은 고딕" w:eastAsia="맑은 고딕"/>
+          <w:sz w:val="21"/>
+        </w:rPr>
+        <w:t>수정본이 있으면 수정본을, 없으면 원문을 기준으로 맞춥니다.</w:t>
+      </w:r>
+    </w:p>
+    <w:p>
+      <w:pPr>
+        <w:pStyle w:val="a0"/>
+        <w:spacing w:before="40" w:after="40"/>
+      </w:pPr>
+      <w:r>
+        <w:rPr>
+          <w:rFonts w:ascii="맑은 고딕" w:hAnsi="맑은 고딕" w:eastAsia="맑은 고딕"/>
+          <w:sz w:val="21"/>
+        </w:rPr>
+        <w:t>왼쪽에서 고른 기준(글자 수 또는 나이스 바이트)을 그대로 따릅니다.</w:t>
+      </w:r>
+    </w:p>
+    <w:p>
+      <w:pPr>
+        <w:pStyle w:val="a0"/>
+        <w:spacing w:before="40" w:after="40"/>
+      </w:pPr>
+      <w:r>
+        <w:rPr>
+          <w:rFonts w:ascii="맑은 고딕" w:hAnsi="맑은 고딕" w:eastAsia="맑은 고딕"/>
+          <w:sz w:val="21"/>
+        </w:rPr>
+        <w:t>'제한 없음' 항목을 골랐거나 초과한 학생이 없으면 단추가 꺼져 있습니다.</w:t>
+      </w:r>
+    </w:p>
+    <w:p>
+      <w:pPr>
+        <w:spacing w:before="160" w:after="80"/>
+      </w:pPr>
+      <w:r>
+        <w:rPr>
+          <w:rFonts w:ascii="맑은 고딕" w:hAnsi="맑은 고딕" w:eastAsia="맑은 고딕"/>
+          <w:b/>
+          <w:sz w:val="21"/>
+        </w:rPr>
+        <w:t>③ 여러 학생에게 반복된 문장 찾기</w:t>
+      </w:r>
+    </w:p>
+    <w:p>
+      <w:pPr>
+        <w:spacing w:before="60" w:after="80"/>
+      </w:pPr>
+      <w:r>
+        <w:rPr>
+          <w:rFonts w:ascii="맑은 고딕" w:hAnsi="맑은 고딕" w:eastAsia="맑은 고딕"/>
+          <w:b w:val="0"/>
+          <w:sz w:val="21"/>
+        </w:rPr>
+        <w:t>같은 문장이 여러 학생 생기부에 들어가 있으면 감사에서 지적받을 수 있습니다. 어떤 문장이 몇 명에게 들어갔는지 표로 보여 줍니다.</w:t>
+      </w:r>
+    </w:p>
+    <w:p>
+      <w:pPr>
+        <w:spacing w:before="160" w:after="40"/>
+        <w:jc w:val="center"/>
+      </w:pPr>
+      <w:r>
+        <w:drawing>
+          <wp:inline xmlns:a="http://schemas.openxmlformats.org/drawingml/2006/main" xmlns:pic="http://schemas.openxmlformats.org/drawingml/2006/picture">
+            <wp:extent cx="5760720" cy="4746048"/>
+            <wp:docPr id="17" name="Picture 17"/>
+            <wp:cNvGraphicFramePr>
+              <a:graphicFrameLocks noChangeAspect="1"/>
+            </wp:cNvGraphicFramePr>
+            <a:graphic>
+              <a:graphicData uri="http://schemas.openxmlformats.org/drawingml/2006/picture">
+                <pic:pic>
+                  <pic:nvPicPr>
+                    <pic:cNvPr id="0" name="fig_shared_sent.png"/>
+                    <pic:cNvPicPr/>
+                  </pic:nvPicPr>
+                  <pic:blipFill>
+                    <a:blip r:embed="rId24"/>
+                    <a:stretch>
+                      <a:fillRect/>
+                    </a:stretch>
+                  </pic:blipFill>
+                  <pic:spPr>
+                    <a:xfrm>
+                      <a:off x="0" y="0"/>
+                      <a:ext cx="5760720" cy="4746048"/>
+                    </a:xfrm>
+                    <a:prstGeom prst="rect"/>
+                  </pic:spPr>
+                </pic:pic>
+              </a:graphicData>
+            </a:graphic>
+          </wp:inline>
+        </w:drawing>
+      </w:r>
+    </w:p>
+    <w:p>
+      <w:pPr>
+        <w:spacing w:before="0" w:after="200"/>
+        <w:jc w:val="center"/>
+      </w:pPr>
+      <w:r>
+        <w:rPr>
+          <w:rFonts w:ascii="맑은 고딕" w:hAnsi="맑은 고딕" w:eastAsia="맑은 고딕"/>
+          <w:b w:val="0"/>
+          <w:i/>
+          <w:color w:val="595959"/>
+          <w:sz w:val="17"/>
+        </w:rPr>
+        <w:t>▲ 세 학생이 똑같이 쓴 문장을 찾아낸 모습</w:t>
+      </w:r>
+    </w:p>
+    <w:tbl>
+      <w:tblPr>
+        <w:tblStyle w:val="af9"/>
+        <w:tblW w:type="auto" w:w="0"/>
+        <w:tblLook w:firstColumn="1" w:firstRow="1" w:lastColumn="0" w:lastRow="0" w:noHBand="0" w:noVBand="1" w:val="04A0"/>
+      </w:tblPr>
+      <w:tblGrid>
+        <w:gridCol w:w="9792"/>
+      </w:tblGrid>
+      <w:tr>
+        <w:tc>
+          <w:tcPr>
+            <w:tcW w:type="dxa" w:w="9072"/>
+            <w:shd w:val="clear" w:fill="EAF2FF"/>
+          </w:tcPr>
+          <w:p>
+            <w:pPr>
+              <w:spacing w:after="60"/>
+            </w:pPr>
+            <w:r>
+              <w:rPr>
+                <w:rFonts w:ascii="맑은 고딕" w:hAnsi="맑은 고딕" w:eastAsia="맑은 고딕"/>
+                <w:b/>
+                <w:sz w:val="21"/>
+              </w:rPr>
+              <w:t>도움말</w:t>
+            </w:r>
+          </w:p>
+          <w:p>
+            <w:pPr>
+              <w:spacing w:before="20" w:after="20" w:line="312" w:lineRule="auto"/>
+            </w:pPr>
+            <w:r>
+              <w:rPr>
+                <w:rFonts w:ascii="맑은 고딕" w:hAnsi="맑은 고딕" w:eastAsia="맑은 고딕"/>
+                <w:sz w:val="20"/>
+              </w:rPr>
+              <w:t>띄어쓰기만 다른 문장도 같은 문장으로 봅니다.</w:t>
+            </w:r>
+          </w:p>
+          <w:p>
+            <w:pPr>
+              <w:spacing w:before="20" w:after="20" w:line="312" w:lineRule="auto"/>
+            </w:pPr>
+            <w:r>
+              <w:rPr>
+                <w:rFonts w:ascii="맑은 고딕" w:hAnsi="맑은 고딕" w:eastAsia="맑은 고딕"/>
+                <w:sz w:val="20"/>
+              </w:rPr>
+              <w:t>표에 나온 문장은 학생별 활동 내용으로 바꿔 개별화해 주세요.</w:t>
+            </w:r>
+          </w:p>
+          <w:p>
+            <w:pPr>
+              <w:spacing w:before="20" w:after="20" w:line="312" w:lineRule="auto"/>
+            </w:pPr>
+            <w:r>
+              <w:rPr>
+                <w:rFonts w:ascii="맑은 고딕" w:hAnsi="맑은 고딕" w:eastAsia="맑은 고딕"/>
+                <w:sz w:val="20"/>
+              </w:rPr>
+              <w:t>바로 위 '학생 간 유사도 검사'는 글 전체가 비슷한 학생을 찾고, 이 기능은 문장 하나하나를 찾습니다.</w:t>
+            </w:r>
+          </w:p>
+        </w:tc>
+      </w:tr>
+    </w:tbl>
+    <w:p>
+      <w:pPr>
+        <w:spacing w:after="40"/>
+      </w:pPr>
+    </w:p>
+    <w:p>
+      <w:pPr>
         <w:pStyle w:val="1"/>
         <w:spacing w:before="320" w:after="140"/>
         <w:rPr>
@@ -5510,6 +5934,172 @@
         <w:rPr>
           <w:lang w:eastAsia="ko-KR"/>
         </w:rPr>
+      </w:pPr>
+    </w:p>
+    <w:p>
+      <w:pPr>
+        <w:pStyle w:val="21"/>
+        <w:spacing w:before="240" w:after="100"/>
+      </w:pPr>
+      <w:r>
+        <w:rPr>
+          <w:rFonts w:ascii="맑은 고딕" w:hAnsi="맑은 고딕" w:eastAsia="맑은 고딕"/>
+          <w:b/>
+          <w:color w:val="1A1A1A"/>
+          <w:sz w:val="26"/>
+        </w:rPr>
+        <w:t>5-6. 잘못 바꿨을 때 되돌리기</w:t>
+      </w:r>
+    </w:p>
+    <w:p>
+      <w:pPr>
+        <w:spacing w:before="60" w:after="80"/>
+      </w:pPr>
+      <w:r>
+        <w:rPr>
+          <w:rFonts w:ascii="맑은 고딕" w:hAnsi="맑은 고딕" w:eastAsia="맑은 고딕"/>
+          <w:b w:val="0"/>
+          <w:sz w:val="21"/>
+        </w:rPr>
+        <w:t>분량을 맞추거나 오탈자를 반영하면 문장이 새 것으로 바뀝니다. 바뀐 결과가 마음에 들지 않으면 이전 문장으로 되돌릴 수 있습니다.</w:t>
+      </w:r>
+    </w:p>
+    <w:p>
+      <w:pPr>
+        <w:spacing w:before="160" w:after="80"/>
+      </w:pPr>
+      <w:r>
+        <w:rPr>
+          <w:rFonts w:ascii="맑은 고딕" w:hAnsi="맑은 고딕" w:eastAsia="맑은 고딕"/>
+          <w:b/>
+          <w:sz w:val="21"/>
+        </w:rPr>
+        <w:t>되돌릴 수 있는 경우</w:t>
+      </w:r>
+    </w:p>
+    <w:p>
+      <w:pPr>
+        <w:pStyle w:val="a0"/>
+        <w:spacing w:before="40" w:after="40"/>
+      </w:pPr>
+      <w:r>
+        <w:rPr>
+          <w:rFonts w:ascii="맑은 고딕" w:hAnsi="맑은 고딕" w:eastAsia="맑은 고딕"/>
+          <w:sz w:val="21"/>
+        </w:rPr>
+        <w:t>분량 맞추기로 글이 줄거나 늘었을 때</w:t>
+      </w:r>
+    </w:p>
+    <w:p>
+      <w:pPr>
+        <w:pStyle w:val="a0"/>
+        <w:spacing w:before="40" w:after="40"/>
+      </w:pPr>
+      <w:r>
+        <w:rPr>
+          <w:rFonts w:ascii="맑은 고딕" w:hAnsi="맑은 고딕" w:eastAsia="맑은 고딕"/>
+          <w:sz w:val="21"/>
+        </w:rPr>
+        <w:t>오탈자 교정을 본문에 적용했을 때</w:t>
+      </w:r>
+    </w:p>
+    <w:p>
+      <w:pPr>
+        <w:pStyle w:val="a0"/>
+        <w:spacing w:before="40" w:after="40"/>
+      </w:pPr>
+      <w:r>
+        <w:rPr>
+          <w:rFonts w:ascii="맑은 고딕" w:hAnsi="맑은 고딕" w:eastAsia="맑은 고딕"/>
+          <w:sz w:val="21"/>
+        </w:rPr>
+        <w:t>피드백을 반영해 초안을 다시 썼을 때</w:t>
+      </w:r>
+    </w:p>
+    <w:p>
+      <w:pPr>
+        <w:pStyle w:val="a0"/>
+        <w:spacing w:before="40" w:after="40"/>
+      </w:pPr>
+      <w:r>
+        <w:rPr>
+          <w:rFonts w:ascii="맑은 고딕" w:hAnsi="맑은 고딕" w:eastAsia="맑은 고딕"/>
+          <w:sz w:val="21"/>
+        </w:rPr>
+        <w:t>수정본을 다시 검토했을 때</w:t>
+      </w:r>
+    </w:p>
+    <w:p>
+      <w:pPr>
+        <w:spacing w:before="120" w:after="80"/>
+      </w:pPr>
+      <w:r>
+        <w:rPr>
+          <w:rFonts w:ascii="맑은 고딕" w:hAnsi="맑은 고딕" w:eastAsia="맑은 고딕"/>
+          <w:b w:val="0"/>
+          <w:sz w:val="21"/>
+        </w:rPr>
+        <w:t>바뀐 글 아래에 ↩️ 되돌리기 단추가 나타납니다. 누르면 바로 앞 문장으로 돌아갑니다. 되돌릴 것이 없으면 단추가 보이지 않습니다.</w:t>
+      </w:r>
+    </w:p>
+    <w:tbl>
+      <w:tblPr>
+        <w:tblStyle w:val="af9"/>
+        <w:tblW w:type="auto" w:w="0"/>
+        <w:tblLook w:firstColumn="1" w:firstRow="1" w:lastColumn="0" w:lastRow="0" w:noHBand="0" w:noVBand="1" w:val="04A0"/>
+      </w:tblPr>
+      <w:tblGrid>
+        <w:gridCol w:w="9792"/>
+      </w:tblGrid>
+      <w:tr>
+        <w:tc>
+          <w:tcPr>
+            <w:tcW w:type="dxa" w:w="9072"/>
+            <w:shd w:val="clear" w:fill="EAF2FF"/>
+          </w:tcPr>
+          <w:p>
+            <w:pPr>
+              <w:spacing w:after="60"/>
+            </w:pPr>
+            <w:r>
+              <w:rPr>
+                <w:rFonts w:ascii="맑은 고딕" w:hAnsi="맑은 고딕" w:eastAsia="맑은 고딕"/>
+                <w:b/>
+                <w:sz w:val="21"/>
+              </w:rPr>
+              <w:t>도움말</w:t>
+            </w:r>
+          </w:p>
+          <w:p>
+            <w:pPr>
+              <w:spacing w:before="20" w:after="20" w:line="312" w:lineRule="auto"/>
+            </w:pPr>
+            <w:r>
+              <w:rPr>
+                <w:rFonts w:ascii="맑은 고딕" w:hAnsi="맑은 고딕" w:eastAsia="맑은 고딕"/>
+                <w:sz w:val="20"/>
+              </w:rPr>
+              <w:t>최근 3번까지 되돌릴 수 있습니다.</w:t>
+            </w:r>
+          </w:p>
+          <w:p>
+            <w:pPr>
+              <w:spacing w:before="20" w:after="20" w:line="312" w:lineRule="auto"/>
+            </w:pPr>
+            <w:r>
+              <w:rPr>
+                <w:rFonts w:ascii="맑은 고딕" w:hAnsi="맑은 고딕" w:eastAsia="맑은 고딕"/>
+                <w:sz w:val="20"/>
+              </w:rPr>
+              <w:t>반 전체를 한꺼번에 처리한 결과는 되돌릴 수 없으니, 일괄 작업 전에는 결과를 미리 내려받아 두세요.</w:t>
+            </w:r>
+          </w:p>
+        </w:tc>
+      </w:tr>
+    </w:tbl>
+    <w:p>
+      <w:pPr>
+        <w:spacing w:after="40"/>
       </w:pPr>
     </w:p>
     <w:p>

</xml_diff>